<commit_message>
sd-vlncn-sct-vn 2026.9.6.2 + vbhc-vn 2.13.1 (K8): dự thảo CV UBND tỉnh chỉ đạo VLNCN bản sửa lần 2 — Sở dẫn điều khoản, Công an/Bộ CHQS viết tổng quát; Sở là cơ quan quản lý PANM
</commit_message>
<xml_diff>
--- a/sd-vlncn-sct-vn/skills/sd-vlncn-sct-vn/vi-du-thuc-te/Du-thao-CV-UBND-tinh-chi-dao-tang-cuong-quan-ly-VLNCN-ban-sua-6.9.2026.docx
+++ b/sd-vlncn-sct-vn/skills/sd-vlncn-sct-vn/vi-du-thuc-te/Du-thao-CV-UBND-tinh-chi-dao-tang-cuong-quan-ly-VLNCN-ban-sua-6.9.2026.docx
@@ -730,7 +730,7 @@
         <w:rPr>
           <w:spacing w:val="2"/>
         </w:rPr>
-        <w:t xml:space="preserve">đ) Thực hiện việc cấp, cấp lại, cấp điều chỉnh Giấy phép sử dụng VLNCN theo đúng nội dung ủy quyền của UBND tỉnh tại Quyết định số 2867/QĐ-UBND ngày 17/8/2026 và trình tự, thủ tục, thời hạn quy định tại Điều 39 Luật số 42/2024/QH15; kiểm tra hồ sơ, điều kiện thực tế trước khi cấp Giấy phép theo quy định tại khoản 6 Điều 39 Luật số 42/2024/QH15. Thẩm định, phê duyệt phương án nổ mìn đối với trường hợp nổ mìn trong khu vực dân cư, khu vực có công trình cần bảo vệ quy định tại điểm d khoản 2 Điều 38 Luật số 42/2024/QH15; việc phê duyệt chỉ thực hiện sau khi đã kiểm tra thực tế hiện trường, bảo đảm đầy đủ các điều kiện an toàn theo QCVN 01:2019/BCT; chịu trách nhiệm trước UBND tỉnh về kết quả thẩm định, phê duyệt.</w:t>
+        <w:t xml:space="preserve">đ) Thực hiện việc cấp, cấp lại, cấp điều chỉnh Giấy phép sử dụng VLNCN theo đúng nội dung ủy quyền của UBND tỉnh tại Quyết định số 2867/QĐ-UBND ngày 17/8/2026 và trình tự, thủ tục, thời hạn quy định tại Điều 39 Luật số 42/2024/QH15. Sở Công Thương là cơ quan quản lý về phương án nổ mìn trên địa bàn tỉnh; thẩm định, phê duyệt phương án nổ mìn đối với trường hợp nổ mìn trong khu vực dân cư, khu vực có công trình cần bảo vệ quy định tại điểm d khoản 2 Điều 38 Luật số 42/2024/QH15.</w:t>
       </w:r>
     </w:p>
     <w:p>
@@ -782,7 +782,7 @@
         <w:rPr>
           <w:spacing w:val="2"/>
         </w:rPr>
-        <w:t xml:space="preserve">a) Tăng cường kiểm tra, kiểm soát hoạt động vận chuyển, bảo quản, sử dụng VLNCN trên địa bàn; quản lý chặt chẽ việc cấp Giấy chứng nhận đủ điều kiện về an ninh, trật tự; chủ động phòng ngừa, đấu tranh, xử lý nghiêm hành vi chế tạo, mua bán, tàng trữ, vận chuyển, sử dụng trái phép vật liệu nổ; điều tra, xử lý theo quy định của pháp luật các trường hợp mất, thất thoát VLNCN.</w:t>
+        <w:t xml:space="preserve">a) Tăng cường kiểm tra, kiểm soát hoạt động vận chuyển, bảo quản, sử dụng VLNCN trên địa bàn; quản lý chặt chẽ việc cấp Giấy chứng nhận đủ điều kiện về an ninh, trật tự và Giấy phép vận chuyển VLNCN; chủ động phòng ngừa, đấu tranh, xử lý nghiêm hành vi chế tạo, mua bán, tàng trữ, vận chuyển, sử dụng trái phép vật liệu nổ; điều tra, xử lý theo quy định của pháp luật các trường hợp mất, thất thoát VLNCN.</w:t>
       </w:r>
     </w:p>
     <w:p>
@@ -799,7 +799,7 @@
         <w:rPr>
           <w:spacing w:val="2"/>
         </w:rPr>
-        <w:t xml:space="preserve">b) Cấp Giấy phép vận chuyển VLNCN theo thẩm quyền quy định tại Điều 41 Luật số 42/2024/QH15 và Thông tư số 75/2024/TT-BCA ngày 15/11/2024 của Bộ trưởng Bộ Công an (được sửa đổi, bổ sung tại Thông tư số 02/2026/TT-BCA và Thông tư số 62/2026/TT-BCA); trong quá trình giải quyết hồ sơ cấp Giấy phép vận chuyển VLNCN cho tổ chức, doanh nghiệp hoạt động dịch vụ nổ mìn, phối hợp với Sở Công Thương đối chiếu địa điểm, thời gian sử dụng VLNCN với nội dung tổ chức, doanh nghiệp đã thông báo với UBND tỉnh; kiểm tra, giám sát việc thực hiện đúng nội dung ghi trong Giấy phép vận chuyển VLNCN theo quy định tại khoản 2 Điều 41 Luật số 42/2024/QH15.</w:t>
+        <w:t xml:space="preserve">b) Thực hiện quản lý nhà nước về phòng cháy, chữa cháy đối với kho VLNCN theo thẩm quyền; hướng dẫn tổ chức, doanh nghiệp thực hiện quy định về nghiệm thu phòng cháy, chữa cháy đối với kho VLNCN, làm cơ sở hoàn thiện hồ sơ đề nghị cấp Giấy phép sử dụng VLNCN.</w:t>
       </w:r>
     </w:p>
     <w:p>
@@ -816,7 +816,7 @@
         <w:rPr>
           <w:spacing w:val="2"/>
         </w:rPr>
-        <w:t xml:space="preserve">c) Thẩm định thiết kế về phòng cháy, chữa cháy đối với các nội dung thuộc thẩm quyền và kiểm tra về phòng cháy, chữa cháy đối với kho VLNCN theo quy định tại Điều 9, Điều 13 Nghị định số 105/2025/NĐ-CP ngày 15/5/2025 của Chính phủ; hướng dẫn tổ chức, doanh nghiệp thực hiện việc nghiệm thu về phòng cháy, chữa cháy đối với kho cố định chứa VLNCN theo Nghị quyết số 66.18/2026/NQ-CP ngày 18/5/2026 của Chính phủ, làm cơ sở để tổ chức, doanh nghiệp hoàn thiện hồ sơ đề nghị cấp Giấy phép sử dụng VLNCN theo quy định tại điểm đ khoản 1 Điều 39 Luật số 42/2024/QH15; rà soát, đơn giản hóa trình tự, thủ tục thuộc thẩm quyền theo quy định.</w:t>
+        <w:t xml:space="preserve">c) Phối hợp với Sở Công Thương kiểm tra việc chấp hành pháp luật về VLNCN của các tổ chức, doanh nghiệp trên địa bàn; trao đổi, cung cấp thông tin về Giấy phép vận chuyển VLNCN đã cấp để phục vụ công tác quản lý; chỉ đạo Công an cấp xã tăng cường quản lý địa bàn, tiếp nhận và xử lý kịp thời tin báo về mất, thất thoát, tai nạn, sự cố liên quan đến VLNCN theo quy định.</w:t>
       </w:r>
     </w:p>
     <w:p>
@@ -831,9 +831,10 @@
       </w:pPr>
       <w:r>
         <w:rPr>
-          <w:spacing w:val="2"/>
-        </w:rPr>
-        <w:t xml:space="preserve">d) Phối hợp với Sở Công Thương kiểm tra việc chấp hành pháp luật về VLNCN của các tổ chức, doanh nghiệp hoạt động dịch vụ nổ mìn và các tổ chức, doanh nghiệp đã thông báo sử dụng VLNCN trên địa bàn; định kỳ 06 tháng cung cấp cho Sở Công Thương thông tin về các Giấy phép vận chuyển VLNCN đã cấp để phục vụ công tác quản lý nhà nước về VLNCN trên địa bàn tỉnh.</w:t>
+          <w:b/>
+          <w:spacing w:val="2"/>
+        </w:rPr>
+        <w:t>3. Bộ Chỉ huy Quân sự tỉnh</w:t>
       </w:r>
     </w:p>
     <w:p>
@@ -850,7 +851,7 @@
         <w:rPr>
           <w:spacing w:val="2"/>
         </w:rPr>
-        <w:t xml:space="preserve">đ) Chỉ đạo Công an cấp xã tăng cường quản lý địa bàn; tiếp nhận báo cáo đột xuất của tổ chức, doanh nghiệp trong thời hạn 24 giờ khi xảy ra xâm nhập trái phép khu vực tồn trữ, mất cắp, thất thoát, tai nạn, sự cố về VLNCN theo quy định tại khoản 4 Điều 17 Thông tư số 23/2024/TT-BCT (được sửa đổi, bổ sung tại Thông tư số 38/2025/TT-BCT ngày 19/6/2025 của Bộ trưởng Bộ Công Thương); giám sát việc tiêu hủy VLNCN theo quy định; kiểm tra việc lắp đặt, duy trì thiết bị truyền tin báo cháy đối với kho VLNCN theo quy định tại Điều 25 Nghị định số 105/2025/NĐ-CP.</w:t>
+        <w:t xml:space="preserve">a) Theo dõi, nắm tình hình hoạt động VLNCN, tiền chất thuốc nổ của các cơ quan, đơn vị, doanh nghiệp thuộc phạm vi quản lý của Bộ Quốc phòng trên địa bàn tỉnh; đôn đốc các đơn vị thông báo bằng văn bản với UBND tỉnh (qua Sở Công Thương) trước khi thực hiện hoạt động VLNCN trên địa bàn theo quy định; kịp thời báo cáo, đề nghị cơ quan có thẩm quyền của Bộ Quốc phòng xử lý các hành vi vi phạm.</w:t>
       </w:r>
     </w:p>
     <w:p>
@@ -865,78 +866,9 @@
       </w:pPr>
       <w:r>
         <w:rPr>
-          <w:b/>
-          <w:spacing w:val="2"/>
-        </w:rPr>
-        <w:t>3. Bộ Chỉ huy Quân sự tỉnh</w:t>
-      </w:r>
-    </w:p>
-    <w:p>
-      <w:pPr>
-        <w:widowControl w:val="0"/>
-        <w:spacing w:before="120"/>
-        <w:ind w:firstLine="720"/>
-        <w:jc w:val="both"/>
-        <w:rPr>
-          <w:spacing w:val="2"/>
-        </w:rPr>
-      </w:pPr>
-      <w:r>
-        <w:rPr>
-          <w:spacing w:val="2"/>
-        </w:rPr>
-        <w:t xml:space="preserve">a) Theo dõi, nắm tình hình hoạt động VLNCN, tiền chất thuốc nổ của các cơ quan, đơn vị, tổ chức, doanh nghiệp thuộc phạm vi quản lý của Bộ Quốc phòng trên địa bàn tỉnh; phối hợp với Sở Công Thương, Công an tỉnh trong công tác quản lý; chủ động phòng ngừa mất, thất thoát VLNCN; báo cáo và đề nghị cơ quan có thẩm quyền của Bộ Quốc phòng xử lý các hành vi vi phạm (nếu có) theo quy định tại Thông tư số 98/2024/TT-BQP ngày 15/11/2024 của Bộ trưởng Bộ Quốc phòng (được sửa đổi, bổ sung tại Thông tư số 09/2026/TT-BQP).</w:t>
-      </w:r>
-    </w:p>
-    <w:p>
-      <w:pPr>
-        <w:widowControl w:val="0"/>
-        <w:spacing w:before="120"/>
-        <w:ind w:firstLine="720"/>
-        <w:jc w:val="both"/>
-        <w:rPr>
-          <w:spacing w:val="2"/>
-        </w:rPr>
-      </w:pPr>
-      <w:r>
-        <w:rPr>
-          <w:spacing w:val="2"/>
-        </w:rPr>
-        <w:t xml:space="preserve">b) Phối hợp với Công an tỉnh kiểm tra, kiểm soát hoạt động vận chuyển VLNCN theo Mệnh lệnh vận chuyển của các đơn vị thuộc phạm vi quản lý của Bộ Quốc phòng trên địa bàn tỉnh; phối hợp bảo vệ phương tiện vận chuyển VLNCN khi nhận được thông báo của người điều khiển phương tiện, người áp tải trong trường hợp phương tiện phải nghỉ qua đêm hoặc gặp sự cố trên địa bàn theo quy định tại điểm e khoản 2 Điều 41 Luật số 42/2024/QH15.</w:t>
-      </w:r>
-    </w:p>
-    <w:p>
-      <w:pPr>
-        <w:widowControl w:val="0"/>
-        <w:spacing w:before="120"/>
-        <w:ind w:firstLine="720"/>
-        <w:jc w:val="both"/>
-        <w:rPr>
-          <w:spacing w:val="2"/>
-        </w:rPr>
-      </w:pPr>
-      <w:r>
-        <w:rPr>
-          <w:spacing w:val="2"/>
-        </w:rPr>
-        <w:t xml:space="preserve">c) Đôn đốc các cơ quan, đơn vị, tổ chức, doanh nghiệp thuộc phạm vi quản lý của Bộ Quốc phòng thông báo bằng văn bản với UBND tỉnh (qua Sở Công Thương) ít nhất 10 ngày trước khi thực hiện các hoạt động trên địa bàn tỉnh theo giấy phép sử dụng VLNCN do Bộ Quốc phòng cấp theo quy định tại điểm đ khoản 2 Điều 38 Luật số 42/2024/QH15.</w:t>
-      </w:r>
-    </w:p>
-    <w:p>
-      <w:pPr>
-        <w:widowControl w:val="0"/>
-        <w:spacing w:before="120"/>
-        <w:ind w:firstLine="720"/>
-        <w:jc w:val="both"/>
-        <w:rPr>
-          <w:spacing w:val="2"/>
-        </w:rPr>
-      </w:pPr>
-      <w:r>
-        <w:rPr>
-          <w:spacing w:val="2"/>
-        </w:rPr>
-        <w:t xml:space="preserve">d) Phối hợp với Sở Công Thương, Công an tỉnh kiểm tra các tổ chức, doanh nghiệp hoạt động dịch vụ nổ mìn thuộc phạm vi quản lý của Bộ Quốc phòng trên địa bàn tỉnh khi được đề nghị; cung cấp thông tin về tình hình hoạt động VLNCN của các cơ quan, đơn vị, tổ chức, doanh nghiệp thuộc phạm vi quản lý của Bộ Quốc phòng trên địa bàn tỉnh để phục vụ công tác quản lý nhà nước về VLNCN.</w:t>
+          <w:spacing w:val="2"/>
+        </w:rPr>
+        <w:t xml:space="preserve">b) Phối hợp với Sở Công Thương, Công an tỉnh kiểm tra, kiểm soát hoạt động vận chuyển, bảo quản, sử dụng VLNCN của các đơn vị thuộc phạm vi quản lý của Bộ Quốc phòng trên địa bàn tỉnh; phối hợp bảo vệ an toàn phương tiện vận chuyển VLNCN khi có yêu cầu.</w:t>
       </w:r>
     </w:p>
     <w:p>

</xml_diff>